<commit_message>
Improve table columns (eliding, visibility, reordering) and dialog scrolling, fix duplicate icons
</commit_message>
<xml_diff>
--- a/LAYOUT_TEST_REPORT.docx
+++ b/LAYOUT_TEST_REPORT.docx
@@ -1077,8 +1077,1404 @@
         <w:t xml:space="preserve">).</w:t>
       </w:r>
     </w:p>
+    <w:p>
+      <w:r>
+        <w:pict>
+          <v:rect style="width:0;height:1.5pt" o:hralign="center" o:hrstd="t" o:hr="t"/>
+        </w:pict>
+      </w:r>
+    </w:p>
     <w:bookmarkEnd w:id="27"/>
     <w:bookmarkEnd w:id="28"/>
+    <w:bookmarkStart w:id="35" w:name="Xf9d9f999c00125534bbcad7d32816a3217a2df8"/>
+    <w:p>
+      <w:pPr>
+        <w:pStyle w:val="Heading1"/>
+      </w:pPr>
+      <w:r>
+        <w:t xml:space="preserve">Results Table and Dialog Improvements (Items 4 &amp; 5)</w:t>
+      </w:r>
+    </w:p>
+    <w:p>
+      <w:pPr>
+        <w:pStyle w:val="FirstParagraph"/>
+      </w:pPr>
+      <w:r>
+        <w:rPr>
+          <w:bCs/>
+          <w:b/>
+        </w:rPr>
+        <w:t xml:space="preserve">Date:</w:t>
+      </w:r>
+      <w:r>
+        <w:t xml:space="preserve"> </w:t>
+      </w:r>
+      <w:r>
+        <w:t xml:space="preserve">2026-09-09</w:t>
+      </w:r>
+    </w:p>
+    <w:bookmarkStart w:id="29" w:name="navigation-icon-fix"/>
+    <w:p>
+      <w:pPr>
+        <w:pStyle w:val="Heading2"/>
+      </w:pPr>
+      <w:r>
+        <w:t xml:space="preserve">Navigation icon fix</w:t>
+      </w:r>
+    </w:p>
+    <w:p>
+      <w:pPr>
+        <w:pStyle w:val="FirstParagraph"/>
+      </w:pPr>
+      <w:r>
+        <w:t xml:space="preserve">“</w:t>
+      </w:r>
+      <w:r>
+        <w:t xml:space="preserve">Build library</w:t>
+      </w:r>
+      <w:r>
+        <w:t xml:space="preserve">”</w:t>
+      </w:r>
+      <w:r>
+        <w:t xml:space="preserve"> </w:t>
+      </w:r>
+      <w:r>
+        <w:t xml:space="preserve">and</w:t>
+      </w:r>
+      <w:r>
+        <w:t xml:space="preserve"> </w:t>
+      </w:r>
+      <w:r>
+        <w:t xml:space="preserve">“</w:t>
+      </w:r>
+      <w:r>
+        <w:t xml:space="preserve">Manage library</w:t>
+      </w:r>
+      <w:r>
+        <w:t xml:space="preserve">”</w:t>
+      </w:r>
+      <w:r>
+        <w:t xml:space="preserve"> </w:t>
+      </w:r>
+      <w:r>
+        <w:t xml:space="preserve">previously used two book-style icons</w:t>
+      </w:r>
+      <w:r>
+        <w:t xml:space="preserve"> </w:t>
+      </w:r>
+      <w:r>
+        <w:t xml:space="preserve">(</w:t>
+      </w:r>
+      <w:r>
+        <w:rPr>
+          <w:rStyle w:val="VerbatimChar"/>
+        </w:rPr>
+        <w:t xml:space="preserve">FIF.LIBRARY</w:t>
+      </w:r>
+      <w:r>
+        <w:t xml:space="preserve"> </w:t>
+      </w:r>
+      <w:r>
+        <w:t xml:space="preserve">and</w:t>
+      </w:r>
+      <w:r>
+        <w:t xml:space="preserve"> </w:t>
+      </w:r>
+      <w:r>
+        <w:rPr>
+          <w:rStyle w:val="VerbatimChar"/>
+        </w:rPr>
+        <w:t xml:space="preserve">FIF.BOOK_SHELF</w:t>
+      </w:r>
+      <w:r>
+        <w:t xml:space="preserve">) that render almost identically.</w:t>
+      </w:r>
+      <w:r>
+        <w:t xml:space="preserve"> </w:t>
+      </w:r>
+      <w:r>
+        <w:t xml:space="preserve">“</w:t>
+      </w:r>
+      <w:r>
+        <w:t xml:space="preserve">Build</w:t>
+      </w:r>
+      <w:r>
+        <w:t xml:space="preserve"> </w:t>
+      </w:r>
+      <w:r>
+        <w:t xml:space="preserve">library</w:t>
+      </w:r>
+      <w:r>
+        <w:t xml:space="preserve">”</w:t>
+      </w:r>
+      <w:r>
+        <w:t xml:space="preserve"> </w:t>
+      </w:r>
+      <w:r>
+        <w:t xml:space="preserve">now uses</w:t>
+      </w:r>
+      <w:r>
+        <w:t xml:space="preserve"> </w:t>
+      </w:r>
+      <w:r>
+        <w:rPr>
+          <w:rStyle w:val="VerbatimChar"/>
+        </w:rPr>
+        <w:t xml:space="preserve">FIF.ADD</w:t>
+      </w:r>
+      <w:r>
+        <w:t xml:space="preserve"> </w:t>
+      </w:r>
+      <w:r>
+        <w:t xml:space="preserve">(a plus icon, signalling</w:t>
+      </w:r>
+      <w:r>
+        <w:t xml:space="preserve"> </w:t>
+      </w:r>
+      <w:r>
+        <w:t xml:space="preserve">“</w:t>
+      </w:r>
+      <w:r>
+        <w:t xml:space="preserve">create</w:t>
+      </w:r>
+      <w:r>
+        <w:t xml:space="preserve">”</w:t>
+      </w:r>
+      <w:r>
+        <w:t xml:space="preserve">), while</w:t>
+      </w:r>
+      <w:r>
+        <w:t xml:space="preserve"> </w:t>
+      </w:r>
+      <w:r>
+        <w:t xml:space="preserve">“</w:t>
+      </w:r>
+      <w:r>
+        <w:t xml:space="preserve">Manage</w:t>
+      </w:r>
+      <w:r>
+        <w:t xml:space="preserve"> </w:t>
+      </w:r>
+      <w:r>
+        <w:t xml:space="preserve">library</w:t>
+      </w:r>
+      <w:r>
+        <w:t xml:space="preserve">”</w:t>
+      </w:r>
+      <w:r>
+        <w:t xml:space="preserve"> </w:t>
+      </w:r>
+      <w:r>
+        <w:t xml:space="preserve">keeps</w:t>
+      </w:r>
+      <w:r>
+        <w:t xml:space="preserve"> </w:t>
+      </w:r>
+      <w:r>
+        <w:rPr>
+          <w:rStyle w:val="VerbatimChar"/>
+        </w:rPr>
+        <w:t xml:space="preserve">FIF.BOOK_SHELF</w:t>
+      </w:r>
+      <w:r>
+        <w:t xml:space="preserve">. The two entries are now visually distinct</w:t>
+      </w:r>
+      <w:r>
+        <w:t xml:space="preserve"> </w:t>
+      </w:r>
+      <w:r>
+        <w:t xml:space="preserve">(see</w:t>
+      </w:r>
+      <w:r>
+        <w:t xml:space="preserve"> </w:t>
+      </w:r>
+      <w:r>
+        <w:rPr>
+          <w:rStyle w:val="VerbatimChar"/>
+        </w:rPr>
+        <w:t xml:space="preserve">test_screenshots/table_wide_1500.png</w:t>
+      </w:r>
+      <w:r>
+        <w:t xml:space="preserve"> </w:t>
+      </w:r>
+      <w:r>
+        <w:t xml:space="preserve">- the left navigation shows a</w:t>
+      </w:r>
+      <w:r>
+        <w:t xml:space="preserve"> </w:t>
+      </w:r>
+      <w:r>
+        <w:t xml:space="preserve">magnifier, a plus, and a book).</w:t>
+      </w:r>
+    </w:p>
+    <w:bookmarkEnd w:id="29"/>
+    <w:bookmarkStart w:id="30" w:name="how-these-results-were-produced-1"/>
+    <w:p>
+      <w:pPr>
+        <w:pStyle w:val="Heading2"/>
+      </w:pPr>
+      <w:r>
+        <w:t xml:space="preserve">How these results were produced</w:t>
+      </w:r>
+    </w:p>
+    <w:p>
+      <w:pPr>
+        <w:pStyle w:val="FirstParagraph"/>
+      </w:pPr>
+      <w:r>
+        <w:t xml:space="preserve">Same method as above: real widgets exercised under Qt’s</w:t>
+      </w:r>
+      <w:r>
+        <w:t xml:space="preserve"> </w:t>
+      </w:r>
+      <w:r>
+        <w:rPr>
+          <w:rStyle w:val="VerbatimChar"/>
+        </w:rPr>
+        <w:t xml:space="preserve">offscreen</w:t>
+      </w:r>
+      <w:r>
+        <w:t xml:space="preserve"> </w:t>
+      </w:r>
+      <w:r>
+        <w:t xml:space="preserve">platform</w:t>
+      </w:r>
+      <w:r>
+        <w:t xml:space="preserve"> </w:t>
+      </w:r>
+      <w:r>
+        <w:t xml:space="preserve">with a 2560x1440 virtual screen, captured with</w:t>
+      </w:r>
+      <w:r>
+        <w:t xml:space="preserve"> </w:t>
+      </w:r>
+      <w:r>
+        <w:rPr>
+          <w:rStyle w:val="VerbatimChar"/>
+        </w:rPr>
+        <w:t xml:space="preserve">QWidget.grab()</w:t>
+      </w:r>
+      <w:r>
+        <w:t xml:space="preserve">. Automated</w:t>
+      </w:r>
+      <w:r>
+        <w:t xml:space="preserve"> </w:t>
+      </w:r>
+      <w:r>
+        <w:t xml:space="preserve">assertions live in</w:t>
+      </w:r>
+      <w:r>
+        <w:t xml:space="preserve"> </w:t>
+      </w:r>
+      <w:r>
+        <w:rPr>
+          <w:rStyle w:val="VerbatimChar"/>
+        </w:rPr>
+        <w:t xml:space="preserve">tools/table_dialog_test.py</w:t>
+      </w:r>
+      <w:r>
+        <w:t xml:space="preserve">; demonstration screenshots are</w:t>
+      </w:r>
+      <w:r>
+        <w:t xml:space="preserve"> </w:t>
+      </w:r>
+      <w:r>
+        <w:t xml:space="preserve">produced by</w:t>
+      </w:r>
+      <w:r>
+        <w:t xml:space="preserve"> </w:t>
+      </w:r>
+      <w:r>
+        <w:rPr>
+          <w:rStyle w:val="VerbatimChar"/>
+        </w:rPr>
+        <w:t xml:space="preserve">tools/table_shots.py</w:t>
+      </w:r>
+      <w:r>
+        <w:t xml:space="preserve">. These are rendered frames, not an</w:t>
+      </w:r>
+      <w:r>
+        <w:t xml:space="preserve"> </w:t>
+      </w:r>
+      <w:r>
+        <w:t xml:space="preserve">interactive click session; the header right-click menu and drag-to-reorder are</w:t>
+      </w:r>
+      <w:r>
+        <w:t xml:space="preserve"> </w:t>
+      </w:r>
+      <w:r>
+        <w:t xml:space="preserve">verified programmatically (menu construction,</w:t>
+      </w:r>
+      <w:r>
+        <w:t xml:space="preserve"> </w:t>
+      </w:r>
+      <w:r>
+        <w:rPr>
+          <w:rStyle w:val="VerbatimChar"/>
+        </w:rPr>
+        <w:t xml:space="preserve">moveSection</w:t>
+      </w:r>
+      <w:r>
+        <w:t xml:space="preserve">, persistence</w:t>
+      </w:r>
+      <w:r>
+        <w:t xml:space="preserve"> </w:t>
+      </w:r>
+      <w:r>
+        <w:t xml:space="preserve">round-trip) rather than by simulating mouse gestures.</w:t>
+      </w:r>
+    </w:p>
+    <w:p>
+      <w:pPr>
+        <w:pStyle w:val="BodyText"/>
+      </w:pPr>
+      <w:r>
+        <w:t xml:space="preserve">Reproduce with:</w:t>
+      </w:r>
+    </w:p>
+    <w:p>
+      <w:pPr>
+        <w:pStyle w:val="SourceCode"/>
+      </w:pPr>
+      <w:r>
+        <w:rPr>
+          <w:rStyle w:val="VerbatimChar"/>
+        </w:rPr>
+        <w:t xml:space="preserve">QT_QPA_PLATFORM="offscreen:configfile=tools/offscreen.json" python tools/table_dialog_test.py</w:t>
+      </w:r>
+      <w:r>
+        <w:br/>
+      </w:r>
+      <w:r>
+        <w:rPr>
+          <w:rStyle w:val="VerbatimChar"/>
+        </w:rPr>
+        <w:t xml:space="preserve">QT_QPA_PLATFORM="offscreen:configfile=tools/offscreen.json" python tools/table_shots.py</w:t>
+      </w:r>
+    </w:p>
+    <w:bookmarkEnd w:id="30"/>
+    <w:bookmarkStart w:id="31" w:name="X95d7ff653f4b5c9f640b527bd614f6e8742a304"/>
+    <w:p>
+      <w:pPr>
+        <w:pStyle w:val="Heading2"/>
+      </w:pPr>
+      <w:r>
+        <w:t xml:space="preserve">Item 4 - results table (30 automated checks, all PASS)</w:t>
+      </w:r>
+    </w:p>
+    <w:tbl>
+      <w:tblPr>
+        <w:tblStyle w:val="Table"/>
+        <w:tblW w:type="pct" w:w="5000"/>
+        <w:tblLook w:firstRow="1" w:lastRow="0" w:firstColumn="0" w:lastColumn="0" w:noHBand="0" w:noVBand="0" w:val="0020"/>
+      </w:tblPr>
+      <w:tblGrid>
+        <w:gridCol w:w="3394"/>
+        <w:gridCol w:w="4525"/>
+      </w:tblGrid>
+      <w:tr>
+        <w:trPr>
+          <w:tblHeader w:val="true"/>
+        </w:trPr>
+        <w:tc>
+          <w:tcPr/>
+          <w:p>
+            <w:pPr>
+              <w:pStyle w:val="Compact"/>
+              <w:jc w:val="left"/>
+            </w:pPr>
+            <w:r>
+              <w:t xml:space="preserve">Area</w:t>
+            </w:r>
+          </w:p>
+        </w:tc>
+        <w:tc>
+          <w:tcPr/>
+          <w:p>
+            <w:pPr>
+              <w:pStyle w:val="Compact"/>
+              <w:jc w:val="left"/>
+            </w:pPr>
+            <w:r>
+              <w:t xml:space="preserve">Result</w:t>
+            </w:r>
+          </w:p>
+        </w:tc>
+      </w:tr>
+      <w:tr>
+        <w:tc>
+          <w:tcPr/>
+          <w:p>
+            <w:pPr>
+              <w:pStyle w:val="Compact"/>
+              <w:jc w:val="left"/>
+            </w:pPr>
+            <w:r>
+              <w:t xml:space="preserve">Long text elides with</w:t>
+            </w:r>
+            <w:r>
+              <w:t xml:space="preserve"> </w:t>
+            </w:r>
+            <w:r>
+              <w:t xml:space="preserve">“</w:t>
+            </w:r>
+            <w:r>
+              <w:t xml:space="preserve">…</w:t>
+            </w:r>
+            <w:r>
+              <w:t xml:space="preserve">”</w:t>
+            </w:r>
+            <w:r>
+              <w:t xml:space="preserve"> </w:t>
+            </w:r>
+            <w:r>
+              <w:t xml:space="preserve">(</w:t>
+            </w:r>
+            <w:r>
+              <w:rPr>
+                <w:rStyle w:val="VerbatimChar"/>
+              </w:rPr>
+              <w:t xml:space="preserve">ElideRight</w:t>
+            </w:r>
+            <w:r>
+              <w:t xml:space="preserve">, word-wrap off)</w:t>
+            </w:r>
+          </w:p>
+        </w:tc>
+        <w:tc>
+          <w:tcPr/>
+          <w:p>
+            <w:pPr>
+              <w:pStyle w:val="Compact"/>
+              <w:jc w:val="left"/>
+            </w:pPr>
+            <w:r>
+              <w:t xml:space="preserve">PASS</w:t>
+            </w:r>
+          </w:p>
+        </w:tc>
+      </w:tr>
+      <w:tr>
+        <w:tc>
+          <w:tcPr/>
+          <w:p>
+            <w:pPr>
+              <w:pStyle w:val="Compact"/>
+              <w:jc w:val="left"/>
+            </w:pPr>
+            <w:r>
+              <w:t xml:space="preserve">Every text cell has a tooltip carrying its full value</w:t>
+            </w:r>
+          </w:p>
+        </w:tc>
+        <w:tc>
+          <w:tcPr/>
+          <w:p>
+            <w:pPr>
+              <w:pStyle w:val="Compact"/>
+              <w:jc w:val="left"/>
+            </w:pPr>
+            <w:r>
+              <w:t xml:space="preserve">PASS</w:t>
+            </w:r>
+          </w:p>
+        </w:tc>
+      </w:tr>
+      <w:tr>
+        <w:tc>
+          <w:tcPr/>
+          <w:p>
+            <w:pPr>
+              <w:pStyle w:val="Compact"/>
+              <w:jc w:val="left"/>
+            </w:pPr>
+            <w:r>
+              <w:t xml:space="preserve">Horizontal + vertical scrolling is per-pixel (smooth)</w:t>
+            </w:r>
+          </w:p>
+        </w:tc>
+        <w:tc>
+          <w:tcPr/>
+          <w:p>
+            <w:pPr>
+              <w:pStyle w:val="Compact"/>
+              <w:jc w:val="left"/>
+            </w:pPr>
+            <w:r>
+              <w:t xml:space="preserve">PASS</w:t>
+            </w:r>
+          </w:p>
+        </w:tc>
+      </w:tr>
+      <w:tr>
+        <w:tc>
+          <w:tcPr/>
+          <w:p>
+            <w:pPr>
+              <w:pStyle w:val="Compact"/>
+              <w:jc w:val="left"/>
+            </w:pPr>
+            <w:r>
+              <w:t xml:space="preserve">Column headers are drag-to-reorder (</w:t>
+            </w:r>
+            <w:r>
+              <w:rPr>
+                <w:rStyle w:val="VerbatimChar"/>
+              </w:rPr>
+              <w:t xml:space="preserve">setSectionsMovable</w:t>
+            </w:r>
+            <w:r>
+              <w:t xml:space="preserve">)</w:t>
+            </w:r>
+          </w:p>
+        </w:tc>
+        <w:tc>
+          <w:tcPr/>
+          <w:p>
+            <w:pPr>
+              <w:pStyle w:val="Compact"/>
+              <w:jc w:val="left"/>
+            </w:pPr>
+            <w:r>
+              <w:t xml:space="preserve">PASS</w:t>
+            </w:r>
+          </w:p>
+        </w:tc>
+      </w:tr>
+      <w:tr>
+        <w:tc>
+          <w:tcPr/>
+          <w:p>
+            <w:pPr>
+              <w:pStyle w:val="Compact"/>
+              <w:jc w:val="left"/>
+            </w:pPr>
+            <w:r>
+              <w:t xml:space="preserve">Header right-click menu has a checkable entry per column</w:t>
+            </w:r>
+          </w:p>
+        </w:tc>
+        <w:tc>
+          <w:tcPr/>
+          <w:p>
+            <w:pPr>
+              <w:pStyle w:val="Compact"/>
+              <w:jc w:val="left"/>
+            </w:pPr>
+            <w:r>
+              <w:t xml:space="preserve">PASS</w:t>
+            </w:r>
+          </w:p>
+        </w:tc>
+      </w:tr>
+      <w:tr>
+        <w:tc>
+          <w:tcPr/>
+          <w:p>
+            <w:pPr>
+              <w:pStyle w:val="Compact"/>
+              <w:jc w:val="left"/>
+            </w:pPr>
+            <w:r>
+              <w:t xml:space="preserve">Column priority defined (Status &gt; Episode &gt; Match% &gt; File &gt; Title &gt; Suggested &gt; Agree)</w:t>
+            </w:r>
+          </w:p>
+        </w:tc>
+        <w:tc>
+          <w:tcPr/>
+          <w:p>
+            <w:pPr>
+              <w:pStyle w:val="Compact"/>
+              <w:jc w:val="left"/>
+            </w:pPr>
+            <w:r>
+              <w:t xml:space="preserve">PASS</w:t>
+            </w:r>
+          </w:p>
+        </w:tc>
+      </w:tr>
+      <w:tr>
+        <w:tc>
+          <w:tcPr/>
+          <w:p>
+            <w:pPr>
+              <w:pStyle w:val="Compact"/>
+              <w:jc w:val="left"/>
+            </w:pPr>
+            <w:r>
+              <w:t xml:space="preserve">Auto-hide: nothing hidden &gt;= 1000px; more hidden as width shrinks</w:t>
+            </w:r>
+          </w:p>
+        </w:tc>
+        <w:tc>
+          <w:tcPr/>
+          <w:p>
+            <w:pPr>
+              <w:pStyle w:val="Compact"/>
+              <w:jc w:val="left"/>
+            </w:pPr>
+            <w:r>
+              <w:t xml:space="preserve">PASS</w:t>
+            </w:r>
+          </w:p>
+        </w:tc>
+      </w:tr>
+      <w:tr>
+        <w:tc>
+          <w:tcPr/>
+          <w:p>
+            <w:pPr>
+              <w:pStyle w:val="Compact"/>
+              <w:jc w:val="left"/>
+            </w:pPr>
+            <w:r>
+              <w:t xml:space="preserve">Essential columns (Select, Status, Episode, Match%, Notes) never auto-hidden or user-hidden</w:t>
+            </w:r>
+          </w:p>
+        </w:tc>
+        <w:tc>
+          <w:tcPr/>
+          <w:p>
+            <w:pPr>
+              <w:pStyle w:val="Compact"/>
+              <w:jc w:val="left"/>
+            </w:pPr>
+            <w:r>
+              <w:t xml:space="preserve">PASS</w:t>
+            </w:r>
+          </w:p>
+        </w:tc>
+      </w:tr>
+      <w:tr>
+        <w:tc>
+          <w:tcPr/>
+          <w:p>
+            <w:pPr>
+              <w:pStyle w:val="Compact"/>
+              <w:jc w:val="left"/>
+            </w:pPr>
+            <w:r>
+              <w:t xml:space="preserve">Widening restores auto-hidden columns</w:t>
+            </w:r>
+          </w:p>
+        </w:tc>
+        <w:tc>
+          <w:tcPr/>
+          <w:p>
+            <w:pPr>
+              <w:pStyle w:val="Compact"/>
+              <w:jc w:val="left"/>
+            </w:pPr>
+            <w:r>
+              <w:t xml:space="preserve">PASS</w:t>
+            </w:r>
+          </w:p>
+        </w:tc>
+      </w:tr>
+      <w:tr>
+        <w:tc>
+          <w:tcPr/>
+          <w:p>
+            <w:pPr>
+              <w:pStyle w:val="Compact"/>
+              <w:jc w:val="left"/>
+            </w:pPr>
+            <w:r>
+              <w:t xml:space="preserve">User show/hide choice persists (</w:t>
+            </w:r>
+            <w:r>
+              <w:rPr>
+                <w:rStyle w:val="VerbatimChar"/>
+              </w:rPr>
+              <w:t xml:space="preserve">column_hidden</w:t>
+            </w:r>
+            <w:r>
+              <w:t xml:space="preserve">)</w:t>
+            </w:r>
+          </w:p>
+        </w:tc>
+        <w:tc>
+          <w:tcPr/>
+          <w:p>
+            <w:pPr>
+              <w:pStyle w:val="Compact"/>
+              <w:jc w:val="left"/>
+            </w:pPr>
+            <w:r>
+              <w:t xml:space="preserve">PASS</w:t>
+            </w:r>
+          </w:p>
+        </w:tc>
+      </w:tr>
+      <w:tr>
+        <w:tc>
+          <w:tcPr/>
+          <w:p>
+            <w:pPr>
+              <w:pStyle w:val="Compact"/>
+              <w:jc w:val="left"/>
+            </w:pPr>
+            <w:r>
+              <w:t xml:space="preserve">Column order persists and restores in a new session (</w:t>
+            </w:r>
+            <w:r>
+              <w:rPr>
+                <w:rStyle w:val="VerbatimChar"/>
+              </w:rPr>
+              <w:t xml:space="preserve">column_order</w:t>
+            </w:r>
+            <w:r>
+              <w:t xml:space="preserve">)</w:t>
+            </w:r>
+          </w:p>
+        </w:tc>
+        <w:tc>
+          <w:tcPr/>
+          <w:p>
+            <w:pPr>
+              <w:pStyle w:val="Compact"/>
+              <w:jc w:val="left"/>
+            </w:pPr>
+            <w:r>
+              <w:t xml:space="preserve">PASS</w:t>
+            </w:r>
+          </w:p>
+        </w:tc>
+      </w:tr>
+    </w:tbl>
+    <w:p>
+      <w:pPr>
+        <w:pStyle w:val="BodyText"/>
+      </w:pPr>
+      <w:r>
+        <w:t xml:space="preserve">Auto-hide thresholds (table viewport width):</w:t>
+      </w:r>
+      <w:r>
+        <w:t xml:space="preserve"> </w:t>
+      </w:r>
+      <w:r>
+        <w:rPr>
+          <w:rStyle w:val="VerbatimChar"/>
+        </w:rPr>
+        <w:t xml:space="preserve">&lt; 1000px</w:t>
+      </w:r>
+      <w:r>
+        <w:t xml:space="preserve"> </w:t>
+      </w:r>
+      <w:r>
+        <w:t xml:space="preserve">hides Samples Agree;</w:t>
+      </w:r>
+      <w:r>
+        <w:t xml:space="preserve"> </w:t>
+      </w:r>
+      <w:r>
+        <w:rPr>
+          <w:rStyle w:val="VerbatimChar"/>
+        </w:rPr>
+        <w:t xml:space="preserve">&lt; 900px</w:t>
+      </w:r>
+      <w:r>
+        <w:t xml:space="preserve"> </w:t>
+      </w:r>
+      <w:r>
+        <w:t xml:space="preserve">also hides Suggested Name;</w:t>
+      </w:r>
+      <w:r>
+        <w:t xml:space="preserve"> </w:t>
+      </w:r>
+      <w:r>
+        <w:rPr>
+          <w:rStyle w:val="VerbatimChar"/>
+        </w:rPr>
+        <w:t xml:space="preserve">&lt; 780px</w:t>
+      </w:r>
+      <w:r>
+        <w:t xml:space="preserve"> </w:t>
+      </w:r>
+      <w:r>
+        <w:t xml:space="preserve">also hides Episode Title;</w:t>
+      </w:r>
+      <w:r>
+        <w:t xml:space="preserve"> </w:t>
+      </w:r>
+      <w:r>
+        <w:rPr>
+          <w:rStyle w:val="VerbatimChar"/>
+        </w:rPr>
+        <w:t xml:space="preserve">&lt; 640px</w:t>
+      </w:r>
+      <w:r>
+        <w:t xml:space="preserve"> </w:t>
+      </w:r>
+      <w:r>
+        <w:t xml:space="preserve">also hides File. Essentials always remain, and a horizontal</w:t>
+      </w:r>
+      <w:r>
+        <w:t xml:space="preserve"> </w:t>
+      </w:r>
+      <w:r>
+        <w:t xml:space="preserve">scrollbar covers anything that still does not fit.</w:t>
+      </w:r>
+    </w:p>
+    <w:p>
+      <w:pPr>
+        <w:pStyle w:val="BodyText"/>
+      </w:pPr>
+      <w:r>
+        <w:t xml:space="preserve">Screenshots:</w:t>
+      </w:r>
+      <w:r>
+        <w:t xml:space="preserve"> </w:t>
+      </w:r>
+      <w:r>
+        <w:t xml:space="preserve">-</w:t>
+      </w:r>
+      <w:r>
+        <w:t xml:space="preserve"> </w:t>
+      </w:r>
+      <w:r>
+        <w:rPr>
+          <w:rStyle w:val="VerbatimChar"/>
+        </w:rPr>
+        <w:t xml:space="preserve">test_screenshots/table_wide_1500.png</w:t>
+      </w:r>
+      <w:r>
+        <w:t xml:space="preserve"> </w:t>
+      </w:r>
+      <w:r>
+        <w:t xml:space="preserve">- all columns visible at 1500px.</w:t>
+      </w:r>
+      <w:r>
+        <w:t xml:space="preserve"> </w:t>
+      </w:r>
+      <w:r>
+        <w:t xml:space="preserve">-</w:t>
+      </w:r>
+      <w:r>
+        <w:t xml:space="preserve"> </w:t>
+      </w:r>
+      <w:r>
+        <w:rPr>
+          <w:rStyle w:val="VerbatimChar"/>
+        </w:rPr>
+        <w:t xml:space="preserve">test_screenshots/table_1366x768.png</w:t>
+      </w:r>
+      <w:r>
+        <w:t xml:space="preserve"> </w:t>
+      </w:r>
+      <w:r>
+        <w:t xml:space="preserve">- 1366x768 target, all columns fit,</w:t>
+      </w:r>
+      <w:r>
+        <w:t xml:space="preserve"> </w:t>
+      </w:r>
+      <w:r>
+        <w:t xml:space="preserve">long Episode Title / Suggested Name cells show the ellipsis.</w:t>
+      </w:r>
+      <w:r>
+        <w:t xml:space="preserve"> </w:t>
+      </w:r>
+      <w:r>
+        <w:t xml:space="preserve">-</w:t>
+      </w:r>
+      <w:r>
+        <w:t xml:space="preserve"> </w:t>
+      </w:r>
+      <w:r>
+        <w:rPr>
+          <w:rStyle w:val="VerbatimChar"/>
+        </w:rPr>
+        <w:t xml:space="preserve">test_screenshots/table_narrow_860.png</w:t>
+      </w:r>
+      <w:r>
+        <w:t xml:space="preserve"> </w:t>
+      </w:r>
+      <w:r>
+        <w:t xml:space="preserve">- at 860px, Episode Title, Suggested</w:t>
+      </w:r>
+      <w:r>
+        <w:t xml:space="preserve"> </w:t>
+      </w:r>
+      <w:r>
+        <w:t xml:space="preserve">Name and Samples Agree are auto-hidden; Status text elides (</w:t>
+      </w:r>
+      <w:r>
+        <w:t xml:space="preserve">“</w:t>
+      </w:r>
+      <w:r>
+        <w:t xml:space="preserve">Rena…</w:t>
+      </w:r>
+      <w:r>
+        <w:t xml:space="preserve">”</w:t>
+      </w:r>
+      <w:r>
+        <w:t xml:space="preserve">).</w:t>
+      </w:r>
+    </w:p>
+    <w:bookmarkEnd w:id="31"/>
+    <w:bookmarkStart w:id="32" w:name="X59b2700e3066f0b1b6017f5658ac4f203550cf6"/>
+    <w:p>
+      <w:pPr>
+        <w:pStyle w:val="Heading2"/>
+      </w:pPr>
+      <w:r>
+        <w:t xml:space="preserve">Item 5 - dialogs (Preview Renames, Customize View)</w:t>
+      </w:r>
+    </w:p>
+    <w:tbl>
+      <w:tblPr>
+        <w:tblStyle w:val="Table"/>
+        <w:tblW w:type="auto" w:w="0"/>
+        <w:tblLook w:firstRow="1" w:lastRow="0" w:firstColumn="0" w:lastColumn="0" w:noHBand="0" w:noVBand="0" w:val="0020"/>
+      </w:tblPr>
+      <w:tblGrid>
+        <w:gridCol w:w="3960"/>
+        <w:gridCol w:w="3960"/>
+      </w:tblGrid>
+      <w:tr>
+        <w:trPr>
+          <w:tblHeader w:val="true"/>
+        </w:trPr>
+        <w:tc>
+          <w:tcPr/>
+          <w:p>
+            <w:pPr>
+              <w:pStyle w:val="Compact"/>
+              <w:jc w:val="left"/>
+            </w:pPr>
+            <w:r>
+              <w:t xml:space="preserve">Check</w:t>
+            </w:r>
+          </w:p>
+        </w:tc>
+        <w:tc>
+          <w:tcPr/>
+          <w:p>
+            <w:pPr>
+              <w:pStyle w:val="Compact"/>
+              <w:jc w:val="left"/>
+            </w:pPr>
+            <w:r>
+              <w:t xml:space="preserve">Result</w:t>
+            </w:r>
+          </w:p>
+        </w:tc>
+      </w:tr>
+      <w:tr>
+        <w:tc>
+          <w:tcPr/>
+          <w:p>
+            <w:pPr>
+              <w:pStyle w:val="Compact"/>
+              <w:jc w:val="left"/>
+            </w:pPr>
+            <w:r>
+              <w:t xml:space="preserve">Preview dialog height capped at 80% of screen</w:t>
+            </w:r>
+          </w:p>
+        </w:tc>
+        <w:tc>
+          <w:tcPr/>
+          <w:p>
+            <w:pPr>
+              <w:pStyle w:val="Compact"/>
+              <w:jc w:val="left"/>
+            </w:pPr>
+            <w:r>
+              <w:t xml:space="preserve">PASS</w:t>
+            </w:r>
+          </w:p>
+        </w:tc>
+      </w:tr>
+      <w:tr>
+        <w:tc>
+          <w:tcPr/>
+          <w:p>
+            <w:pPr>
+              <w:pStyle w:val="Compact"/>
+              <w:jc w:val="left"/>
+            </w:pPr>
+            <w:r>
+              <w:t xml:space="preserve">Preview dialog file list scrolls; button row fixed at bottom</w:t>
+            </w:r>
+          </w:p>
+        </w:tc>
+        <w:tc>
+          <w:tcPr/>
+          <w:p>
+            <w:pPr>
+              <w:pStyle w:val="Compact"/>
+              <w:jc w:val="left"/>
+            </w:pPr>
+            <w:r>
+              <w:t xml:space="preserve">PASS</w:t>
+            </w:r>
+          </w:p>
+        </w:tc>
+      </w:tr>
+      <w:tr>
+        <w:tc>
+          <w:tcPr/>
+          <w:p>
+            <w:pPr>
+              <w:pStyle w:val="Compact"/>
+              <w:jc w:val="left"/>
+            </w:pPr>
+            <w:r>
+              <w:t xml:space="preserve">Preview dialog buttons wrap via FlowLayout on narrow windows</w:t>
+            </w:r>
+          </w:p>
+        </w:tc>
+        <w:tc>
+          <w:tcPr/>
+          <w:p>
+            <w:pPr>
+              <w:pStyle w:val="Compact"/>
+              <w:jc w:val="left"/>
+            </w:pPr>
+            <w:r>
+              <w:t xml:space="preserve">PASS</w:t>
+            </w:r>
+          </w:p>
+        </w:tc>
+      </w:tr>
+      <w:tr>
+        <w:tc>
+          <w:tcPr/>
+          <w:p>
+            <w:pPr>
+              <w:pStyle w:val="Compact"/>
+              <w:jc w:val="left"/>
+            </w:pPr>
+            <w:r>
+              <w:t xml:space="preserve">Preview dialog min width clamped to fit small screens</w:t>
+            </w:r>
+          </w:p>
+        </w:tc>
+        <w:tc>
+          <w:tcPr/>
+          <w:p>
+            <w:pPr>
+              <w:pStyle w:val="Compact"/>
+              <w:jc w:val="left"/>
+            </w:pPr>
+            <w:r>
+              <w:t xml:space="preserve">PASS</w:t>
+            </w:r>
+          </w:p>
+        </w:tc>
+      </w:tr>
+      <w:tr>
+        <w:tc>
+          <w:tcPr/>
+          <w:p>
+            <w:pPr>
+              <w:pStyle w:val="Compact"/>
+              <w:jc w:val="left"/>
+            </w:pPr>
+            <w:r>
+              <w:t xml:space="preserve">Customize dialog content wrapped in a</w:t>
+            </w:r>
+            <w:r>
+              <w:t xml:space="preserve"> </w:t>
+            </w:r>
+            <w:r>
+              <w:rPr>
+                <w:rStyle w:val="VerbatimChar"/>
+              </w:rPr>
+              <w:t xml:space="preserve">QScrollArea</w:t>
+            </w:r>
+          </w:p>
+        </w:tc>
+        <w:tc>
+          <w:tcPr/>
+          <w:p>
+            <w:pPr>
+              <w:pStyle w:val="Compact"/>
+              <w:jc w:val="left"/>
+            </w:pPr>
+            <w:r>
+              <w:t xml:space="preserve">PASS</w:t>
+            </w:r>
+          </w:p>
+        </w:tc>
+      </w:tr>
+      <w:tr>
+        <w:tc>
+          <w:tcPr/>
+          <w:p>
+            <w:pPr>
+              <w:pStyle w:val="Compact"/>
+              <w:jc w:val="left"/>
+            </w:pPr>
+            <w:r>
+              <w:t xml:space="preserve">Customize dialog height capped at 80%; buttons in FlowLayout</w:t>
+            </w:r>
+          </w:p>
+        </w:tc>
+        <w:tc>
+          <w:tcPr/>
+          <w:p>
+            <w:pPr>
+              <w:pStyle w:val="Compact"/>
+              <w:jc w:val="left"/>
+            </w:pPr>
+            <w:r>
+              <w:t xml:space="preserve">PASS</w:t>
+            </w:r>
+          </w:p>
+        </w:tc>
+      </w:tr>
+      <w:tr>
+        <w:tc>
+          <w:tcPr/>
+          <w:p>
+            <w:pPr>
+              <w:pStyle w:val="Compact"/>
+              <w:jc w:val="left"/>
+            </w:pPr>
+            <w:r>
+              <w:t xml:space="preserve">Customize dialog still reports checkbox selections correctly</w:t>
+            </w:r>
+          </w:p>
+        </w:tc>
+        <w:tc>
+          <w:tcPr/>
+          <w:p>
+            <w:pPr>
+              <w:pStyle w:val="Compact"/>
+              <w:jc w:val="left"/>
+            </w:pPr>
+            <w:r>
+              <w:t xml:space="preserve">PASS</w:t>
+            </w:r>
+          </w:p>
+        </w:tc>
+      </w:tr>
+    </w:tbl>
+    <w:p>
+      <w:pPr>
+        <w:pStyle w:val="BodyText"/>
+      </w:pPr>
+      <w:r>
+        <w:t xml:space="preserve">Screenshot:</w:t>
+      </w:r>
+      <w:r>
+        <w:t xml:space="preserve"> </w:t>
+      </w:r>
+      <w:r>
+        <w:rPr>
+          <w:rStyle w:val="VerbatimChar"/>
+        </w:rPr>
+        <w:t xml:space="preserve">test_screenshots/dialog_preview_renames.png</w:t>
+      </w:r>
+      <w:r>
+        <w:t xml:space="preserve"> </w:t>
+      </w:r>
+      <w:r>
+        <w:t xml:space="preserve">- a 60-item preview</w:t>
+      </w:r>
+      <w:r>
+        <w:t xml:space="preserve"> </w:t>
+      </w:r>
+      <w:r>
+        <w:t xml:space="preserve">list scrolling with the Cancel / Proceed with copy buttons fixed at the bottom</w:t>
+      </w:r>
+      <w:r>
+        <w:t xml:space="preserve"> </w:t>
+      </w:r>
+      <w:r>
+        <w:t xml:space="preserve">(captured mid fade-in, hence the light appearance).</w:t>
+      </w:r>
+    </w:p>
+    <w:bookmarkEnd w:id="32"/>
+    <w:bookmarkStart w:id="33" w:name="Xe3d6d64c7d5149580eb1f01cb08705aced7d2a6"/>
+    <w:p>
+      <w:pPr>
+        <w:pStyle w:val="Heading2"/>
+      </w:pPr>
+      <w:r>
+        <w:t xml:space="preserve">Persistence keys added to</w:t>
+      </w:r>
+      <w:r>
+        <w:t xml:space="preserve"> </w:t>
+      </w:r>
+      <w:r>
+        <w:rPr>
+          <w:rStyle w:val="VerbatimChar"/>
+        </w:rPr>
+        <w:t xml:space="preserve">gui_config.json</w:t>
+      </w:r>
+      <w:r>
+        <w:t xml:space="preserve"> </w:t>
+      </w:r>
+      <w:r>
+        <w:t xml:space="preserve">(under</w:t>
+      </w:r>
+      <w:r>
+        <w:t xml:space="preserve"> </w:t>
+      </w:r>
+      <w:r>
+        <w:rPr>
+          <w:rStyle w:val="VerbatimChar"/>
+        </w:rPr>
+        <w:t xml:space="preserve">identify_page</w:t>
+      </w:r>
+      <w:r>
+        <w:t xml:space="preserve">)</w:t>
+      </w:r>
+    </w:p>
+    <w:p>
+      <w:pPr>
+        <w:numPr>
+          <w:ilvl w:val="0"/>
+          <w:numId w:val="1005"/>
+        </w:numPr>
+        <w:pStyle w:val="Compact"/>
+      </w:pPr>
+      <w:r>
+        <w:rPr>
+          <w:rStyle w:val="VerbatimChar"/>
+        </w:rPr>
+        <w:t xml:space="preserve">column_order</w:t>
+      </w:r>
+      <w:r>
+        <w:t xml:space="preserve"> </w:t>
+      </w:r>
+      <w:r>
+        <w:t xml:space="preserve">- list of logical column indices in the user’s chosen order.</w:t>
+      </w:r>
+    </w:p>
+    <w:p>
+      <w:pPr>
+        <w:numPr>
+          <w:ilvl w:val="0"/>
+          <w:numId w:val="1005"/>
+        </w:numPr>
+        <w:pStyle w:val="Compact"/>
+      </w:pPr>
+      <w:r>
+        <w:rPr>
+          <w:rStyle w:val="VerbatimChar"/>
+        </w:rPr>
+        <w:t xml:space="preserve">column_hidden</w:t>
+      </w:r>
+      <w:r>
+        <w:t xml:space="preserve"> </w:t>
+      </w:r>
+      <w:r>
+        <w:t xml:space="preserve">- list of logical column indices the user chose to hide.</w:t>
+      </w:r>
+    </w:p>
+    <w:p>
+      <w:pPr>
+        <w:pStyle w:val="FirstParagraph"/>
+      </w:pPr>
+      <w:r>
+        <w:t xml:space="preserve">(</w:t>
+      </w:r>
+      <w:r>
+        <w:rPr>
+          <w:rStyle w:val="VerbatimChar"/>
+        </w:rPr>
+        <w:t xml:space="preserve">column_widths</w:t>
+      </w:r>
+      <w:r>
+        <w:t xml:space="preserve">,</w:t>
+      </w:r>
+      <w:r>
+        <w:t xml:space="preserve"> </w:t>
+      </w:r>
+      <w:r>
+        <w:rPr>
+          <w:rStyle w:val="VerbatimChar"/>
+        </w:rPr>
+        <w:t xml:space="preserve">sort_col</w:t>
+      </w:r>
+      <w:r>
+        <w:t xml:space="preserve">,</w:t>
+      </w:r>
+      <w:r>
+        <w:t xml:space="preserve"> </w:t>
+      </w:r>
+      <w:r>
+        <w:rPr>
+          <w:rStyle w:val="VerbatimChar"/>
+        </w:rPr>
+        <w:t xml:space="preserve">sort_order</w:t>
+      </w:r>
+      <w:r>
+        <w:t xml:space="preserve">,</w:t>
+      </w:r>
+      <w:r>
+        <w:t xml:space="preserve"> </w:t>
+      </w:r>
+      <w:r>
+        <w:rPr>
+          <w:rStyle w:val="VerbatimChar"/>
+        </w:rPr>
+        <w:t xml:space="preserve">status_filter</w:t>
+      </w:r>
+      <w:r>
+        <w:t xml:space="preserve"> </w:t>
+      </w:r>
+      <w:r>
+        <w:t xml:space="preserve">were already</w:t>
+      </w:r>
+      <w:r>
+        <w:t xml:space="preserve"> </w:t>
+      </w:r>
+      <w:r>
+        <w:t xml:space="preserve">persisted.)</w:t>
+      </w:r>
+    </w:p>
+    <w:bookmarkEnd w:id="33"/>
+    <w:bookmarkStart w:id="34" w:name="summary-1"/>
+    <w:p>
+      <w:pPr>
+        <w:pStyle w:val="Heading2"/>
+      </w:pPr>
+      <w:r>
+        <w:t xml:space="preserve">Summary</w:t>
+      </w:r>
+    </w:p>
+    <w:p>
+      <w:pPr>
+        <w:pStyle w:val="FirstParagraph"/>
+      </w:pPr>
+      <w:r>
+        <w:t xml:space="preserve">All 30 table/dialog automated checks pass, plus the full application suite</w:t>
+      </w:r>
+      <w:r>
+        <w:t xml:space="preserve"> </w:t>
+      </w:r>
+      <w:r>
+        <w:t xml:space="preserve">(80 passed, 1 skipped) and</w:t>
+      </w:r>
+      <w:r>
+        <w:t xml:space="preserve"> </w:t>
+      </w:r>
+      <w:r>
+        <w:rPr>
+          <w:rStyle w:val="VerbatimChar"/>
+        </w:rPr>
+        <w:t xml:space="preserve">ruff</w:t>
+      </w:r>
+      <w:r>
+        <w:t xml:space="preserve"> </w:t>
+      </w:r>
+      <w:r>
+        <w:t xml:space="preserve">remain clean. The duplicate navigation icon</w:t>
+      </w:r>
+      <w:r>
+        <w:t xml:space="preserve"> </w:t>
+      </w:r>
+      <w:r>
+        <w:t xml:space="preserve">is resolved.</w:t>
+      </w:r>
+    </w:p>
+    <w:bookmarkEnd w:id="34"/>
+    <w:bookmarkEnd w:id="35"/>
     <w:sectPr/>
   </w:body>
 </w:document>
@@ -1274,6 +2670,9 @@
     <w:abstractNumId w:val="991"/>
   </w:num>
   <w:num w:numId="1004">
+    <w:abstractNumId w:val="991"/>
+  </w:num>
+  <w:num w:numId="1005">
     <w:abstractNumId w:val="991"/>
   </w:num>
 </w:numbering>

</xml_diff>